<commit_message>
feat: add office-cli templates, references, and Mendeley integration scripts
</commit_message>
<xml_diff>
--- a/templates/template_laporan_praktikum.docx
+++ b/templates/template_laporan_praktikum.docx
@@ -142,7 +142,7 @@
         <w:rPr>
           <w:b/>
         </w:rPr>
-        <w:t>Salim Hidayat</w:t>
+        <w:t>[Nama Mahasiswa]</w:t>
       </w:r>
     </w:p>
     <w:p>
@@ -157,14 +157,13 @@
         <w:rPr>
           <w:b/>
         </w:rPr>
-        <w:t>2433003</w:t>
+        <w:t>[NIM]</w:t>
       </w:r>
       <w:r>
         <w:rPr>
           <w:b/>
           <w:lang w:val="id-ID"/>
         </w:rPr>
-        <w:t>0</w:t>
       </w:r>
     </w:p>
     <w:p>

</xml_diff>